<commit_message>
update demo test LoadBalancer
</commit_message>
<xml_diff>
--- a/Tuan3/NguyenThanhTrung_22669481_Tuan03.docx
+++ b/Tuan3/NguyenThanhTrung_22669481_Tuan03.docx
@@ -38,7 +38,16 @@
           <w:i/>
           <w:iCs/>
         </w:rPr>
-        <w:t>Bài 1. Hệ thống quản lý thư mục và tập tin theo mô hình cây</w:t>
+        <w:t xml:space="preserve">BÀI 1. </w:t>
+      </w:r>
+      <w:r>
+        <w:rPr>
+          <w:b/>
+          <w:bCs/>
+          <w:i/>
+          <w:iCs/>
+        </w:rPr>
+        <w:t>Hệ thống quản lý thư mục và tập tin theo mô hình cây</w:t>
       </w:r>
     </w:p>
     <w:p>
@@ -60,6 +69,9 @@
     </w:p>
     <w:p>
       <w:r>
+        <w:rPr>
+          <w:noProof/>
+        </w:rPr>
         <w:drawing>
           <wp:inline distT="0" distB="0" distL="0" distR="0" wp14:anchorId="73117A59" wp14:editId="1CF6EC7C">
             <wp:extent cx="5731510" cy="2096770"/>
@@ -229,6 +241,9 @@
         <w:ind w:left="360"/>
       </w:pPr>
       <w:r>
+        <w:rPr>
+          <w:noProof/>
+        </w:rPr>
         <w:drawing>
           <wp:inline distT="0" distB="0" distL="0" distR="0" wp14:anchorId="4310E50F" wp14:editId="7A30439E">
             <wp:extent cx="5731510" cy="1329690"/>
@@ -321,8 +336,6 @@
         </w:drawing>
       </w:r>
     </w:p>
-    <w:p/>
-    <w:p/>
     <w:p/>
     <w:sectPr>
       <w:pgSz w:w="11906" w:h="16838"/>

</xml_diff>